<commit_message>
fix(docs): resolve Mermaid syntax parse error on GitHub markdown renderer
</commit_message>
<xml_diff>
--- a/PROJECT_REPORT.docx
+++ b/PROJECT_REPORT.docx
@@ -565,104 +565,94 @@
         </w:rPr>
         <w:t>flowchart TD</w:t>
         <w:br/>
-        <w:t xml:space="preserve">  subgraph EdgeTier["Edge &amp; Ingress Tier"]</w:t>
+        <w:t xml:space="preserve">  subgraph Clients["Clients and Edge Tier"]</w:t>
         <w:br/>
-        <w:t xml:space="preserve">    Client["Client Browser&lt;br/&gt;(YouTube-Style UI)"]</w:t>
+        <w:t xml:space="preserve">    User["Client Browser"]</w:t>
         <w:br/>
-        <w:t xml:space="preserve">    CF["Amazon CloudFront CDN&lt;br/&gt;(Global Edge Locations)"]</w:t>
+        <w:t xml:space="preserve">    CF["Amazon CloudFront CDN"]</w:t>
         <w:br/>
-        <w:t xml:space="preserve">    OAC["Origin Access Control (OAC)"]</w:t>
+        <w:t xml:space="preserve">    OAC["Origin Access Control OAC"]</w:t>
         <w:br/>
         <w:t xml:space="preserve">  end</w:t>
         <w:br/>
         <w:br/>
-        <w:t xml:space="preserve">  subgraph ControlPlane["Control Plane (API Service)"]</w:t>
+        <w:t xml:space="preserve">  subgraph Ingestion["Ingestion and Control Plane"]</w:t>
         <w:br/>
-        <w:t xml:space="preserve">    ALB["Application Load Balancer (ALB)&lt;br/&gt;(Path: /api/*)"]</w:t>
+        <w:t xml:space="preserve">    ALB["Application Load Balancer ALB"]</w:t>
         <w:br/>
-        <w:t xml:space="preserve">    API["FastAPI Control Service&lt;br/&gt;(ECS Fargate On-Demand)"]</w:t>
+        <w:t xml:space="preserve">    API["FastAPI Control Service"]</w:t>
         <w:br/>
-        <w:t xml:space="preserve">    DDB[("Amazon DynamoDB&lt;br/&gt;(videos table)")]</w:t>
+        <w:t xml:space="preserve">    DDB[("DynamoDB Table: videos")]</w:t>
         <w:br/>
-        <w:t xml:space="preserve">    S3_UP[("S3 Uploads Bucket&lt;br/&gt;(raw/{id}.mp4)")]</w:t>
+        <w:t xml:space="preserve">    S3_UP[("S3 Uploads Bucket: raw")]</w:t>
         <w:br/>
         <w:t xml:space="preserve">  end</w:t>
         <w:br/>
         <w:br/>
-        <w:t xml:space="preserve">  subgraph WorkerPlane["Transcoding &amp; Processing Plane"]</w:t>
+        <w:t xml:space="preserve">  subgraph AsyncProcessing["Asynchronous Processing Plane"]</w:t>
         <w:br/>
-        <w:t xml:space="preserve">    SQS["Amazon SQS Queue&lt;br/&gt;(video-jobs)"]</w:t>
+        <w:t xml:space="preserve">    SQS["SQS Video Jobs Queue"]</w:t>
         <w:br/>
-        <w:t xml:space="preserve">    DLQ["Dead-Letter Queue&lt;br/&gt;(video-jobs-dlq)"]</w:t>
+        <w:t xml:space="preserve">    DLQ["SQS Dead-Letter Queue"]</w:t>
         <w:br/>
-        <w:t xml:space="preserve">    CW["CloudWatch Alarms&lt;br/&gt;(Queue Depth &amp; Backlog)"]</w:t>
+        <w:t xml:space="preserve">    CW["CloudWatch Queue Alarms"]</w:t>
         <w:br/>
-        <w:t xml:space="preserve">    AAS["Application Auto Scaling&lt;br/&gt;(0 to 3 Workers)"]</w:t>
+        <w:t xml:space="preserve">    AAS["Application Auto Scaling"]</w:t>
         <w:br/>
-        <w:t xml:space="preserve">    Worker["Transcoding Worker Pool&lt;br/&gt;(ECS Fargate Spot + FFmpeg 7.1)"]</w:t>
+        <w:t xml:space="preserve">    Worker["Transcoding Worker Fleet: Fargate Spot"]</w:t>
         <w:br/>
         <w:t xml:space="preserve">  end</w:t>
         <w:br/>
         <w:br/>
-        <w:t xml:space="preserve">  subgraph StorageTier["Media &amp; Static Assets"]</w:t>
+        <w:t xml:space="preserve">  subgraph StorageDelivery["Storage and Delivery Plane"]</w:t>
         <w:br/>
-        <w:t xml:space="preserve">    S3_PR[("S3 Processed Bucket&lt;br/&gt;(720p, 480p, Thumbnails)")]</w:t>
+        <w:t xml:space="preserve">    S3_PR[("S3 Processed Bucket: 720p 480p")]</w:t>
         <w:br/>
-        <w:t xml:space="preserve">    S3_FE[("S3 Frontend Static Bucket&lt;br/&gt;(HTML, CSS, JS)")]</w:t>
+        <w:t xml:space="preserve">    S3_FE[("S3 Frontend Static Bucket")]</w:t>
         <w:br/>
         <w:t xml:space="preserve">  end</w:t>
         <w:br/>
         <w:br/>
-        <w:t xml:space="preserve">  %% Client Requests</w:t>
+        <w:t xml:space="preserve">  User --&gt;|"1. HTTPS Request"| CF</w:t>
         <w:br/>
-        <w:t xml:space="preserve">  Client --&gt;|1. HTTPS Request| CF</w:t>
+        <w:t xml:space="preserve">  CF --&gt;|"2a. Route Default Static"| S3_FE</w:t>
         <w:br/>
-        <w:t xml:space="preserve">  CF --&gt;|Route /*| S3_FE</w:t>
+        <w:t xml:space="preserve">  CF --&gt;|"2b. Route API Requests"| ALB</w:t>
         <w:br/>
-        <w:t xml:space="preserve">  CF --&gt;|Route /api/*| ALB</w:t>
-        <w:br/>
-        <w:t xml:space="preserve">  CF --&gt;|Route /processed/*| OAC</w:t>
+        <w:t xml:space="preserve">  CF --&gt;|"2c. Route Media Requests"| OAC</w:t>
         <w:br/>
         <w:t xml:space="preserve">  OAC --&gt; S3_PR</w:t>
         <w:br/>
         <w:br/>
-        <w:t xml:space="preserve">  %% Upload Ingress</w:t>
-        <w:br/>
         <w:t xml:space="preserve">  ALB --&gt; API</w:t>
         <w:br/>
-        <w:t xml:space="preserve">  API --&gt;|2. Register Metadata| DDB</w:t>
+        <w:t xml:space="preserve">  API --&gt;|"3. Register Metadata"| DDB</w:t>
         <w:br/>
-        <w:t xml:space="preserve">  API -.-&gt;|3. Presigned PUT URL| Client</w:t>
+        <w:t xml:space="preserve">  API -.-&gt;|"4. Presigned S3 PUT URL"| User</w:t>
         <w:br/>
-        <w:t xml:space="preserve">  Client --&gt;|4. Direct PUT Upload| S3_UP</w:t>
+        <w:t xml:space="preserve">  User --&gt;|"5. Direct PUT Upload"| S3_UP</w:t>
         <w:br/>
         <w:br/>
-        <w:t xml:space="preserve">  %% Queue &amp; Worker</w:t>
+        <w:t xml:space="preserve">  S3_UP --&gt;|"6. ObjectCreated Event"| SQS</w:t>
         <w:br/>
-        <w:t xml:space="preserve">  S3_UP --&gt;|5. s3:ObjectCreated:*| SQS</w:t>
+        <w:t xml:space="preserve">  SQS --&gt;|"Failed 3x"| DLQ</w:t>
         <w:br/>
-        <w:t xml:space="preserve">  SQS --&gt;|Max 3 Failures| DLQ</w:t>
+        <w:t xml:space="preserve">  SQS -.-&gt;|"Backlog Metric"| CW</w:t>
         <w:br/>
-        <w:t xml:space="preserve">  SQS -.-&gt;|Backlog Metric| CW</w:t>
+        <w:t xml:space="preserve">  CW --&gt;|"Trigger Alarm"| AAS</w:t>
         <w:br/>
-        <w:t xml:space="preserve">  CW --&gt;|Trigger Scaling| AAS</w:t>
+        <w:t xml:space="preserve">  AAS --&gt;|"Scale 0 to 3 Workers"| Worker</w:t>
         <w:br/>
-        <w:t xml:space="preserve">  AAS --&gt;|Scale Out/In (0-3)| Worker</w:t>
-        <w:br/>
-        <w:t xml:space="preserve">  SQS --&gt;|6. Long-Poll Receive| Worker</w:t>
+        <w:t xml:space="preserve">  SQS --&gt;|"7. Long-Poll Receive"| Worker</w:t>
         <w:br/>
         <w:br/>
-        <w:t xml:space="preserve">  %% Transcoding &amp; Delivery</w:t>
+        <w:t xml:space="preserve">  Worker --&gt;|"8. Fetch Raw Video"| S3_UP</w:t>
         <w:br/>
-        <w:t xml:space="preserve">  Worker --&gt;|7. Pull Raw File| S3_UP</w:t>
+        <w:t xml:space="preserve">  Worker --&gt;|"9. Encode 720p 480p and Thumb"| S3_PR</w:t>
         <w:br/>
-        <w:t xml:space="preserve">  Worker --&gt;|8. FFmpeg Transcode| Worker</w:t>
+        <w:t xml:space="preserve">  Worker --&gt;|"10. Update Status Ready"| DDB</w:t>
         <w:br/>
-        <w:t xml:space="preserve">  Worker --&gt;|9. Push 720p, 480p, thumb| S3_PR</w:t>
-        <w:br/>
-        <w:t xml:space="preserve">  Worker --&gt;|10. Set Status: ready| DDB</w:t>
-        <w:br/>
-        <w:t xml:space="preserve">  Worker --&gt;|11. Delete Message| SQS</w:t>
+        <w:t xml:space="preserve">  Worker --&gt;|"11. Delete SQS Message"| SQS</w:t>
       </w:r>
     </w:p>
     <w:p>

</xml_diff>